<commit_message>
Update CVs to Lai_Man_To_CV_* naming with all formats (pdf, docx, md, txt)
</commit_message>
<xml_diff>
--- a/files/Lai_CV_Business-Development.docx
+++ b/files/Lai_CV_Business-Development.docx
@@ -392,103 +392,6 @@
           <w:szCs w:val="20"/>
         </w:rPr>
         <w:t>Negotiated and secured 5 corporate sponsorships through professional pitching and collaboration with local industry partners</w:t>
-      </w:r>
-    </w:p>
-    <w:p>
-      <w:pPr>
-        <w:tabs>
-          <w:tab w:val="right" w:pos="9360"/>
-        </w:tabs>
-        <w:spacing w:before="160" w:after="0"/>
-      </w:pPr>
-      <w:r>
-        <w:rPr>
-          <w:rFonts w:ascii="Arial" w:cs="Arial" w:eastAsia="Arial" w:hAnsi="Arial"/>
-          <w:b/>
-          <w:bCs/>
-          <w:sz w:val="21"/>
-          <w:szCs w:val="21"/>
-        </w:rPr>
-        <w:t>Lead Climbing Coach &amp; Data Manager</w:t>
-      </w:r>
-      <w:r>
-        <w:rPr>
-          <w:rFonts w:ascii="Arial" w:cs="Arial" w:eastAsia="Arial" w:hAnsi="Arial"/>
-          <w:color w:val="888888"/>
-          <w:sz w:val="18"/>
-          <w:szCs w:val="18"/>
-        </w:rPr>
-        <w:t>2024 – Present</w:t>
-      </w:r>
-    </w:p>
-    <w:p>
-      <w:pPr>
-        <w:spacing w:before="0" w:after="40"/>
-      </w:pPr>
-      <w:r>
-        <w:rPr>
-          <w:rFonts w:ascii="Arial" w:cs="Arial" w:eastAsia="Arial" w:hAnsi="Arial"/>
-          <w:i/>
-          <w:iCs/>
-          <w:color w:val="B8613E"/>
-          <w:sz w:val="19"/>
-          <w:szCs w:val="19"/>
-        </w:rPr>
-        <w:t>Lead Climbing Gyms</w:t>
-      </w:r>
-    </w:p>
-    <w:p>
-      <w:pPr>
-        <w:pStyle w:val="ListParagraph"/>
-        <w:numPr>
-          <w:ilvl w:val="0"/>
-          <w:numId w:val="2"/>
-        </w:numPr>
-        <w:spacing w:before="28" w:after="28"/>
-      </w:pPr>
-      <w:r>
-        <w:rPr>
-          <w:rFonts w:ascii="Arial" w:cs="Arial" w:eastAsia="Arial" w:hAnsi="Arial"/>
-          <w:sz w:val="20"/>
-          <w:szCs w:val="20"/>
-        </w:rPr>
-        <w:t>Delivered customised training programmes for 20+ students, translating complex biomechanics into actionable concepts</w:t>
-      </w:r>
-    </w:p>
-    <w:p>
-      <w:pPr>
-        <w:pStyle w:val="ListParagraph"/>
-        <w:numPr>
-          <w:ilvl w:val="0"/>
-          <w:numId w:val="2"/>
-        </w:numPr>
-        <w:spacing w:before="28" w:after="28"/>
-      </w:pPr>
-      <w:r>
-        <w:rPr>
-          <w:rFonts w:ascii="Arial" w:cs="Arial" w:eastAsia="Arial" w:hAnsi="Arial"/>
-          <w:sz w:val="20"/>
-          <w:szCs w:val="20"/>
-        </w:rPr>
-        <w:t>Managed client database of 300+ entries in Excel; improved operational efficiency and student retention metrics</w:t>
-      </w:r>
-    </w:p>
-    <w:p>
-      <w:pPr>
-        <w:pStyle w:val="ListParagraph"/>
-        <w:numPr>
-          <w:ilvl w:val="0"/>
-          <w:numId w:val="2"/>
-        </w:numPr>
-        <w:spacing w:before="28" w:after="28"/>
-      </w:pPr>
-      <w:r>
-        <w:rPr>
-          <w:rFonts w:ascii="Arial" w:cs="Arial" w:eastAsia="Arial" w:hAnsi="Arial"/>
-          <w:sz w:val="20"/>
-          <w:szCs w:val="20"/>
-        </w:rPr>
-        <w:t>Facilitated relations between management and clients; coordinated schedules and resolved service-level issues</w:t>
       </w:r>
     </w:p>
     <w:p>

</xml_diff>